<commit_message>
Apply business changes without env file
</commit_message>
<xml_diff>
--- a/src/template/aramco_template-no-regulatory-legal.docx
+++ b/src/template/aramco_template-no-regulatory-legal.docx
@@ -2424,6 +2424,47 @@
           <w:szCs w:val="18"/>
           <w:lang w:val="en"/>
         </w:rPr>
+        <w:t>executive_summary</w:t>
+      </w:r>
+      <w:proofErr w:type="spellEnd"/>
+      <w:r>
+        <w:rPr>
+          <w:rFonts w:ascii="EYInterstate Light" w:hAnsi="EYInterstate Light" w:cs="Arial"/>
+          <w:sz w:val="18"/>
+          <w:szCs w:val="18"/>
+          <w:lang w:val="en"/>
+        </w:rPr>
+        <w:t>}}</w:t>
+      </w:r>
+    </w:p>
+    <w:p>
+      <w:pPr>
+        <w:pStyle w:val="NormalWeb"/>
+        <w:spacing w:before="0" w:beforeAutospacing="0" w:after="120" w:afterAutospacing="0" w:line="240" w:lineRule="atLeast"/>
+        <w:rPr>
+          <w:rFonts w:ascii="EYInterstate Light" w:hAnsi="EYInterstate Light" w:cs="Arial"/>
+          <w:sz w:val="18"/>
+          <w:szCs w:val="18"/>
+          <w:lang w:val="en"/>
+        </w:rPr>
+      </w:pPr>
+      <w:r>
+        <w:rPr>
+          <w:rFonts w:ascii="EYInterstate Light" w:hAnsi="EYInterstate Light" w:cs="Arial"/>
+          <w:sz w:val="18"/>
+          <w:szCs w:val="18"/>
+          <w:lang w:val="en"/>
+        </w:rPr>
+        <w:t>{{</w:t>
+      </w:r>
+      <w:proofErr w:type="spellStart"/>
+      <w:r>
+        <w:rPr>
+          <w:rFonts w:ascii="EYInterstate Light" w:hAnsi="EYInterstate Light" w:cs="Arial"/>
+          <w:sz w:val="18"/>
+          <w:szCs w:val="18"/>
+          <w:lang w:val="en"/>
+        </w:rPr>
         <w:t>overall_rating</w:t>
       </w:r>
       <w:proofErr w:type="spellEnd"/>
@@ -2467,7 +2508,27 @@
           <w:sz w:val="18"/>
           <w:szCs w:val="18"/>
         </w:rPr>
-        <w:t>The below ratings are assigned:</w:t>
+        <w:t xml:space="preserve">The </w:t>
+      </w:r>
+      <w:proofErr w:type="gramStart"/>
+      <w:r>
+        <w:rPr>
+          <w:rFonts w:cs="Arial"/>
+          <w:color w:val="000000"/>
+          <w:sz w:val="18"/>
+          <w:szCs w:val="18"/>
+        </w:rPr>
+        <w:t>below ratings</w:t>
+      </w:r>
+      <w:proofErr w:type="gramEnd"/>
+      <w:r>
+        <w:rPr>
+          <w:rFonts w:cs="Arial"/>
+          <w:color w:val="000000"/>
+          <w:sz w:val="18"/>
+          <w:szCs w:val="18"/>
+        </w:rPr>
+        <w:t xml:space="preserve"> are assigned:</w:t>
       </w:r>
     </w:p>
     <w:p>
@@ -3778,7 +3839,23 @@
                                 <w:color w:val="404040"/>
                                 <w:szCs w:val="18"/>
                               </w:rPr>
-                              <w:t>The information included in this report has been primarily collected from databases or public sources, thus it is difficult to verify all aspects of the information obtained. EY makes no representation or warranties with respect to the contents or use of this report, and specifically disclaims any express or implied warranties or usefulness for any particular purpose of this report. EY takes no responsibility for the consequences resulting from decisions based on information included in this report. EY reserves the right to change or revise this report at any time.</w:t>
+                              <w:t xml:space="preserve">The information included in this report has been primarily collected from databases or public sources, thus it is difficult to verify all aspects of the information obtained. EY makes no representation or warranties with respect to the contents or use of this </w:t>
+                            </w:r>
+                            <w:proofErr w:type="gramStart"/>
+                            <w:r>
+                              <w:rPr>
+                                <w:color w:val="404040"/>
+                                <w:szCs w:val="18"/>
+                              </w:rPr>
+                              <w:t>report, and</w:t>
+                            </w:r>
+                            <w:proofErr w:type="gramEnd"/>
+                            <w:r>
+                              <w:rPr>
+                                <w:color w:val="404040"/>
+                                <w:szCs w:val="18"/>
+                              </w:rPr>
+                              <w:t xml:space="preserve"> specifically disclaims any express or implied warranties or usefulness for any particular purpose of this report. EY takes no responsibility for the consequences resulting from decisions based on information included in this report. EY reserves the right to change or revise this report at any time.</w:t>
                             </w:r>
                           </w:p>
                           <w:p>
@@ -9413,16 +9490,6 @@
 </file>
 
 <file path=customXml/item1.xml><?xml version="1.0" encoding="utf-8"?>
-<p:properties xmlns:p="http://schemas.microsoft.com/office/2006/metadata/properties" xmlns:xsi="http://www.w3.org/2001/XMLSchema-instance" xmlns:pc="http://schemas.microsoft.com/office/infopath/2007/PartnerControls">
-  <documentManagement/>
-</p:properties>
-</file>
-
-<file path=customXml/item2.xml><?xml version="1.0" encoding="utf-8"?>
-<b:Sources xmlns:b="http://schemas.openxmlformats.org/officeDocument/2006/bibliography" xmlns="http://schemas.openxmlformats.org/officeDocument/2006/bibliography" SelectedStyle="\APA.XSL" StyleName="APA"/>
-</file>
-
-<file path=customXml/item3.xml><?xml version="1.0" encoding="utf-8"?>
 <ct:contentTypeSchema xmlns:ct="http://schemas.microsoft.com/office/2006/metadata/contentType" xmlns:ma="http://schemas.microsoft.com/office/2006/metadata/properties/metaAttributes" ct:_="" ma:_="" ma:contentTypeName="Document" ma:contentTypeID="0x010100A71026F7D2CD654DA270B69B3B9C932C" ma:contentTypeVersion="8" ma:contentTypeDescription="Create a new document." ma:contentTypeScope="" ma:versionID="aae167a2bada60bd5813a05922b0dee2">
   <xsd:schema xmlns:xsd="http://www.w3.org/2001/XMLSchema" xmlns:xs="http://www.w3.org/2001/XMLSchema" xmlns:p="http://schemas.microsoft.com/office/2006/metadata/properties" xmlns:ns2="2ade480b-8d75-40d4-8676-2c13afbdad3b" targetNamespace="http://schemas.microsoft.com/office/2006/metadata/properties" ma:root="true" ma:fieldsID="c06d9c7a63b7d3ee30a78728387f0545" ns2:_="">
     <xsd:import namespace="2ade480b-8d75-40d4-8676-2c13afbdad3b"/>
@@ -9590,6 +9657,16 @@
 </ct:contentTypeSchema>
 </file>
 
+<file path=customXml/item2.xml><?xml version="1.0" encoding="utf-8"?>
+<b:Sources xmlns:b="http://schemas.openxmlformats.org/officeDocument/2006/bibliography" xmlns="http://schemas.openxmlformats.org/officeDocument/2006/bibliography" SelectedStyle="\APA.XSL" StyleName="APA"/>
+</file>
+
+<file path=customXml/item3.xml><?xml version="1.0" encoding="utf-8"?>
+<p:properties xmlns:p="http://schemas.microsoft.com/office/2006/metadata/properties" xmlns:xsi="http://www.w3.org/2001/XMLSchema-instance" xmlns:pc="http://schemas.microsoft.com/office/infopath/2007/PartnerControls">
+  <documentManagement/>
+</p:properties>
+</file>
+
 <file path=customXml/item4.xml><?xml version="1.0" encoding="utf-8"?>
 <?mso-contentType ?>
 <FormTemplates xmlns="http://schemas.microsoft.com/sharepoint/v3/contenttype/forms">
@@ -9600,23 +9677,6 @@
 </file>
 
 <file path=customXml/itemProps1.xml><?xml version="1.0" encoding="utf-8"?>
-<ds:datastoreItem xmlns:ds="http://schemas.openxmlformats.org/officeDocument/2006/customXml" ds:itemID="{94358819-FB5F-449E-85A4-5D85794C62C4}">
-  <ds:schemaRefs>
-    <ds:schemaRef ds:uri="http://schemas.microsoft.com/office/2006/metadata/properties"/>
-    <ds:schemaRef ds:uri="http://schemas.microsoft.com/office/infopath/2007/PartnerControls"/>
-  </ds:schemaRefs>
-</ds:datastoreItem>
-</file>
-
-<file path=customXml/itemProps2.xml><?xml version="1.0" encoding="utf-8"?>
-<ds:datastoreItem xmlns:ds="http://schemas.openxmlformats.org/officeDocument/2006/customXml" ds:itemID="{BBB5644E-888B-4FCB-8002-588F25079580}">
-  <ds:schemaRefs>
-    <ds:schemaRef ds:uri="http://schemas.openxmlformats.org/officeDocument/2006/bibliography"/>
-  </ds:schemaRefs>
-</ds:datastoreItem>
-</file>
-
-<file path=customXml/itemProps3.xml><?xml version="1.0" encoding="utf-8"?>
 <ds:datastoreItem xmlns:ds="http://schemas.openxmlformats.org/officeDocument/2006/customXml" ds:itemID="{196A128D-01D0-4685-A837-E7C18A70AA92}">
   <ds:schemaRefs>
     <ds:schemaRef ds:uri="http://schemas.microsoft.com/office/2006/metadata/contentType"/>
@@ -9634,6 +9694,23 @@
 </ds:datastoreItem>
 </file>
 
+<file path=customXml/itemProps2.xml><?xml version="1.0" encoding="utf-8"?>
+<ds:datastoreItem xmlns:ds="http://schemas.openxmlformats.org/officeDocument/2006/customXml" ds:itemID="{BBB5644E-888B-4FCB-8002-588F25079580}">
+  <ds:schemaRefs>
+    <ds:schemaRef ds:uri="http://schemas.openxmlformats.org/officeDocument/2006/bibliography"/>
+  </ds:schemaRefs>
+</ds:datastoreItem>
+</file>
+
+<file path=customXml/itemProps3.xml><?xml version="1.0" encoding="utf-8"?>
+<ds:datastoreItem xmlns:ds="http://schemas.openxmlformats.org/officeDocument/2006/customXml" ds:itemID="{94358819-FB5F-449E-85A4-5D85794C62C4}">
+  <ds:schemaRefs>
+    <ds:schemaRef ds:uri="http://schemas.microsoft.com/office/2006/metadata/properties"/>
+    <ds:schemaRef ds:uri="http://schemas.microsoft.com/office/infopath/2007/PartnerControls"/>
+  </ds:schemaRefs>
+</ds:datastoreItem>
+</file>
+
 <file path=customXml/itemProps4.xml><?xml version="1.0" encoding="utf-8"?>
 <ds:datastoreItem xmlns:ds="http://schemas.openxmlformats.org/officeDocument/2006/customXml" ds:itemID="{A7F7E29C-FC7B-4A04-BB0B-C5462BC54D06}">
   <ds:schemaRefs>

</xml_diff>